<commit_message>
Job Search: AI-powered process with six agents
One agent per session (career profile, resume optimizer, skills to openings,
interview coach, application assistant, job search manager), adapted from
the AI for Workforce Readiness Agent Labs. Worksheets gain an agent log, and
a downloadable toolkit holds all six starter instructions.

Co-Authored-By: Claude Opus 5.5 <noreply@anthropic.com>
</commit_message>
<xml_diff>
--- a/assignments/JS-J1-Target-Role.docx
+++ b/assignments/JS-J1-Target-Role.docx
@@ -1016,6 +1016,188 @@
         </w:rPr>
       </w:r>
     </w:p>
+    <w:p>
+      <w:pPr>
+        <w:pStyle w:val="Heading2"/>
+      </w:pPr>
+      <w:r>
+        <w:t>Agent log · Career Profile Agent</w:t>
+      </w:r>
+    </w:p>
+    <w:p>
+      <w:r>
+        <w:rPr>
+          <w:b w:val="0"/>
+          <w:i/>
+          <w:color w:val="5A6378"/>
+        </w:rPr>
+        <w:t>Record how you set up and checked the agent. Starter instructions are on the Job Search page and in the AI Job Search Toolkit.</w:t>
+      </w:r>
+    </w:p>
+    <w:tbl>
+      <w:tblPr>
+        <w:tblW w:w="9647" w:type="dxa"/>
+        <w:jc w:val="center"/>
+        <w:tblBorders>
+          <w:top w:val="single" w:sz="6" w:color="B9C2D4"/>
+          <w:left w:val="single" w:sz="6" w:color="B9C2D4"/>
+          <w:bottom w:val="single" w:sz="6" w:color="B9C2D4"/>
+          <w:right w:val="single" w:sz="6" w:color="B9C2D4"/>
+          <w:insideH w:val="single" w:sz="6" w:color="B9C2D4"/>
+          <w:insideV w:val="single" w:sz="6" w:color="B9C2D4"/>
+        </w:tblBorders>
+        <w:tblLayout w:type="fixed"/>
+        <w:tblLook w:firstColumn="1" w:firstRow="1" w:lastColumn="0" w:lastRow="0" w:noHBand="0" w:noVBand="1" w:val="04A0"/>
+      </w:tblPr>
+      <w:tblGrid>
+        <w:gridCol w:w="3456"/>
+        <w:gridCol w:w="6192"/>
+      </w:tblGrid>
+      <w:tr>
+        <w:tc>
+          <w:tcPr>
+            <w:tcW w:type="dxa" w:w="3456"/>
+            <w:shd w:val="clear" w:color="auto" w:fill="3A56A6"/>
+          </w:tcPr>
+          <w:p>
+            <w:r>
+              <w:rPr>
+                <w:b/>
+                <w:color w:val="FFFFFF"/>
+                <w:sz w:val="20"/>
+              </w:rPr>
+            </w:r>
+          </w:p>
+        </w:tc>
+        <w:tc>
+          <w:tcPr>
+            <w:tcW w:type="dxa" w:w="6192"/>
+            <w:shd w:val="clear" w:color="auto" w:fill="3A56A6"/>
+          </w:tcPr>
+          <w:p>
+            <w:r>
+              <w:rPr>
+                <w:b/>
+                <w:color w:val="FFFFFF"/>
+                <w:sz w:val="20"/>
+              </w:rPr>
+              <w:t>My answer</w:t>
+            </w:r>
+          </w:p>
+        </w:tc>
+      </w:tr>
+      <w:tr>
+        <w:trPr>
+          <w:trHeight w:val="864" w:hRule="atLeast"/>
+        </w:trPr>
+        <w:tc>
+          <w:tcPr>
+            <w:tcW w:type="dxa" w:w="3456"/>
+          </w:tcPr>
+          <w:p>
+            <w:r>
+              <w:rPr>
+                <w:b/>
+                <w:sz w:val="20"/>
+              </w:rPr>
+              <w:t>What I put in the [brackets] (no private details)</w:t>
+            </w:r>
+          </w:p>
+        </w:tc>
+        <w:tc>
+          <w:tcPr>
+            <w:tcW w:type="dxa" w:w="6192"/>
+          </w:tcPr>
+          <w:p/>
+        </w:tc>
+      </w:tr>
+      <w:tr>
+        <w:trPr>
+          <w:trHeight w:val="864" w:hRule="atLeast"/>
+        </w:trPr>
+        <w:tc>
+          <w:tcPr>
+            <w:tcW w:type="dxa" w:w="3456"/>
+          </w:tcPr>
+          <w:p>
+            <w:r>
+              <w:rPr>
+                <w:b/>
+                <w:sz w:val="20"/>
+              </w:rPr>
+              <w:t>Something the agent got wrong, or I had to check</w:t>
+            </w:r>
+          </w:p>
+        </w:tc>
+        <w:tc>
+          <w:tcPr>
+            <w:tcW w:type="dxa" w:w="6192"/>
+          </w:tcPr>
+          <w:p/>
+        </w:tc>
+      </w:tr>
+      <w:tr>
+        <w:trPr>
+          <w:trHeight w:val="864" w:hRule="atLeast"/>
+        </w:trPr>
+        <w:tc>
+          <w:tcPr>
+            <w:tcW w:type="dxa" w:w="3456"/>
+          </w:tcPr>
+          <w:p>
+            <w:r>
+              <w:rPr>
+                <w:b/>
+                <w:sz w:val="20"/>
+              </w:rPr>
+              <w:t>How I revised the instructions</w:t>
+            </w:r>
+          </w:p>
+        </w:tc>
+        <w:tc>
+          <w:tcPr>
+            <w:tcW w:type="dxa" w:w="6192"/>
+          </w:tcPr>
+          <w:p/>
+        </w:tc>
+      </w:tr>
+      <w:tr>
+        <w:trPr>
+          <w:trHeight w:val="864" w:hRule="atLeast"/>
+        </w:trPr>
+        <w:tc>
+          <w:tcPr>
+            <w:tcW w:type="dxa" w:w="3456"/>
+          </w:tcPr>
+          <w:p>
+            <w:r>
+              <w:rPr>
+                <w:b/>
+                <w:sz w:val="20"/>
+              </w:rPr>
+              <w:t>Where I checked it (link, posting, or person)</w:t>
+            </w:r>
+          </w:p>
+        </w:tc>
+        <w:tc>
+          <w:tcPr>
+            <w:tcW w:type="dxa" w:w="6192"/>
+          </w:tcPr>
+          <w:p/>
+        </w:tc>
+      </w:tr>
+    </w:tbl>
+    <w:p>
+      <w:pPr>
+        <w:spacing w:after="40"/>
+      </w:pPr>
+      <w:r>
+        <w:rPr>
+          <w:b w:val="0"/>
+          <w:i w:val="0"/>
+        </w:rPr>
+      </w:r>
+    </w:p>
     <w:tbl>
       <w:tblPr>
         <w:tblW w:w="9648" w:type="dxa"/>
@@ -1277,7 +1459,7 @@
                 <w:b/>
                 <w:sz w:val="19"/>
               </w:rPr>
-              <w:t>Must-haves (Part 2)</w:t>
+              <w:t>Must-haves, target, and ladder (Part 2, Part 3)</w:t>
             </w:r>
           </w:p>
         </w:tc>
@@ -1291,7 +1473,7 @@
                 <w:b w:val="0"/>
                 <w:sz w:val="19"/>
               </w:rPr>
-              <w:t>Clear, realistic must-haves and nice-to-haves.</w:t>
+              <w:t>Realistic must-haves and a target role placed on the ladder with a next step.</w:t>
             </w:r>
           </w:p>
         </w:tc>
@@ -1305,7 +1487,7 @@
                 <w:b w:val="0"/>
                 <w:sz w:val="19"/>
               </w:rPr>
-              <w:t>Some rows vague.</w:t>
+              <w:t>Partly complete.</w:t>
             </w:r>
           </w:p>
         </w:tc>
@@ -1335,7 +1517,7 @@
                 <w:b/>
                 <w:sz w:val="19"/>
               </w:rPr>
-              <w:t>Target role and ladder (questions 1–2)</w:t>
+              <w:t>Agent log</w:t>
             </w:r>
           </w:p>
         </w:tc>
@@ -1349,7 +1531,7 @@
                 <w:b w:val="0"/>
                 <w:sz w:val="19"/>
               </w:rPr>
-              <w:t>A target role that fits, placed on the ladder with a next step.</w:t>
+              <w:t>Career Profile Agent set up with no private details, checked, and revised.</w:t>
             </w:r>
           </w:p>
         </w:tc>
@@ -1363,7 +1545,7 @@
                 <w:b w:val="0"/>
                 <w:sz w:val="19"/>
               </w:rPr>
-              <w:t>Partly explained.</w:t>
+              <w:t>Log is incomplete.</w:t>
             </w:r>
           </w:p>
         </w:tc>

</xml_diff>